<commit_message>
Agregar los wireframes y figma
</commit_message>
<xml_diff>
--- a/PROYECTO FINAL/INFORME/INFORME FINAL.docx
+++ b/PROYECTO FINAL/INFORME/INFORME FINAL.docx
@@ -673,13 +673,23 @@
                 <w:szCs w:val="24"/>
               </w:rPr>
             </w:pPr>
+            <w:proofErr w:type="spellStart"/>
             <w:r>
               <w:rPr>
                 <w:rFonts w:ascii="Times New Roman" w:eastAsia="Calibri" w:hAnsi="Times New Roman" w:cs="Times New Roman"/>
                 <w:sz w:val="24"/>
                 <w:szCs w:val="24"/>
               </w:rPr>
-              <w:t>Geradth Humberto</w:t>
+              <w:t>Geradth</w:t>
+            </w:r>
+            <w:proofErr w:type="spellEnd"/>
+            <w:r>
+              <w:rPr>
+                <w:rFonts w:ascii="Times New Roman" w:eastAsia="Calibri" w:hAnsi="Times New Roman" w:cs="Times New Roman"/>
+                <w:sz w:val="24"/>
+                <w:szCs w:val="24"/>
+              </w:rPr>
+              <w:t xml:space="preserve"> Humberto</w:t>
             </w:r>
           </w:p>
         </w:tc>
@@ -753,13 +763,23 @@
                 <w:szCs w:val="24"/>
               </w:rPr>
             </w:pPr>
+            <w:proofErr w:type="spellStart"/>
             <w:r>
               <w:rPr>
                 <w:rFonts w:ascii="Times New Roman" w:eastAsia="Calibri" w:hAnsi="Times New Roman" w:cs="Times New Roman"/>
                 <w:sz w:val="24"/>
                 <w:szCs w:val="24"/>
               </w:rPr>
-              <w:t>Huisa Valle,</w:t>
+              <w:t>Huisa</w:t>
+            </w:r>
+            <w:proofErr w:type="spellEnd"/>
+            <w:r>
+              <w:rPr>
+                <w:rFonts w:ascii="Times New Roman" w:eastAsia="Calibri" w:hAnsi="Times New Roman" w:cs="Times New Roman"/>
+                <w:sz w:val="24"/>
+                <w:szCs w:val="24"/>
+              </w:rPr>
+              <w:t xml:space="preserve"> Valle,</w:t>
             </w:r>
           </w:p>
           <w:p>
@@ -1146,7 +1166,7 @@
         </w:rPr>
         <w:fldChar w:fldCharType="separate"/>
       </w:r>
-      <w:hyperlink w:anchor="_Toc232757464" w:history="1">
+      <w:hyperlink w:anchor="_Toc233459930" w:history="1">
         <w:r>
           <w:rPr>
             <w:rStyle w:val="Hipervnculo"/>
@@ -1173,7 +1193,7 @@
             <w:noProof/>
             <w:webHidden/>
           </w:rPr>
-          <w:instrText xml:space="preserve"> PAGEREF _Toc232757464 \h </w:instrText>
+          <w:instrText xml:space="preserve"> PAGEREF _Toc233459930 \h </w:instrText>
         </w:r>
         <w:r>
           <w:rPr>
@@ -1193,7 +1213,7 @@
             <w:noProof/>
             <w:webHidden/>
           </w:rPr>
-          <w:t>4</w:t>
+          <w:t>5</w:t>
         </w:r>
         <w:r>
           <w:rPr>
@@ -1220,7 +1240,7 @@
           <w14:ligatures w14:val="standardContextual"/>
         </w:rPr>
       </w:pPr>
-      <w:hyperlink w:anchor="_Toc232757465" w:history="1">
+      <w:hyperlink w:anchor="_Toc233459931" w:history="1">
         <w:r>
           <w:rPr>
             <w:rStyle w:val="Hipervnculo"/>
@@ -1265,7 +1285,7 @@
             <w:noProof/>
             <w:webHidden/>
           </w:rPr>
-          <w:instrText xml:space="preserve"> PAGEREF _Toc232757465 \h </w:instrText>
+          <w:instrText xml:space="preserve"> PAGEREF _Toc233459931 \h </w:instrText>
         </w:r>
         <w:r>
           <w:rPr>
@@ -1285,7 +1305,7 @@
             <w:noProof/>
             <w:webHidden/>
           </w:rPr>
-          <w:t>4</w:t>
+          <w:t>5</w:t>
         </w:r>
         <w:r>
           <w:rPr>
@@ -1312,7 +1332,7 @@
           <w14:ligatures w14:val="standardContextual"/>
         </w:rPr>
       </w:pPr>
-      <w:hyperlink w:anchor="_Toc232757466" w:history="1">
+      <w:hyperlink w:anchor="_Toc233459932" w:history="1">
         <w:r>
           <w:rPr>
             <w:rStyle w:val="Hipervnculo"/>
@@ -1336,7 +1356,7 @@
             <w:rStyle w:val="Hipervnculo"/>
             <w:noProof/>
           </w:rPr>
-          <w:t>Limitaciones identificadas</w:t>
+          <w:t>Formulación del problema</w:t>
         </w:r>
         <w:r>
           <w:rPr>
@@ -1357,7 +1377,7 @@
             <w:noProof/>
             <w:webHidden/>
           </w:rPr>
-          <w:instrText xml:space="preserve"> PAGEREF _Toc232757466 \h </w:instrText>
+          <w:instrText xml:space="preserve"> PAGEREF _Toc233459932 \h </w:instrText>
         </w:r>
         <w:r>
           <w:rPr>
@@ -1377,7 +1397,7 @@
             <w:noProof/>
             <w:webHidden/>
           </w:rPr>
-          <w:t>4</w:t>
+          <w:t>5</w:t>
         </w:r>
         <w:r>
           <w:rPr>
@@ -1404,7 +1424,7 @@
           <w14:ligatures w14:val="standardContextual"/>
         </w:rPr>
       </w:pPr>
-      <w:hyperlink w:anchor="_Toc232757467" w:history="1">
+      <w:hyperlink w:anchor="_Toc233459933" w:history="1">
         <w:r>
           <w:rPr>
             <w:rStyle w:val="Hipervnculo"/>
@@ -1428,7 +1448,7 @@
             <w:rStyle w:val="Hipervnculo"/>
             <w:noProof/>
           </w:rPr>
-          <w:t>Entrevistas Breves a los Representantes</w:t>
+          <w:t>Limitaciones identificadas</w:t>
         </w:r>
         <w:r>
           <w:rPr>
@@ -1449,7 +1469,7 @@
             <w:noProof/>
             <w:webHidden/>
           </w:rPr>
-          <w:instrText xml:space="preserve"> PAGEREF _Toc232757467 \h </w:instrText>
+          <w:instrText xml:space="preserve"> PAGEREF _Toc233459933 \h </w:instrText>
         </w:r>
         <w:r>
           <w:rPr>
@@ -1469,7 +1489,7 @@
             <w:noProof/>
             <w:webHidden/>
           </w:rPr>
-          <w:t>4</w:t>
+          <w:t>5</w:t>
         </w:r>
         <w:r>
           <w:rPr>
@@ -1496,7 +1516,7 @@
           <w14:ligatures w14:val="standardContextual"/>
         </w:rPr>
       </w:pPr>
-      <w:hyperlink w:anchor="_Toc232757468" w:history="1">
+      <w:hyperlink w:anchor="_Toc233459934" w:history="1">
         <w:r>
           <w:rPr>
             <w:rStyle w:val="Hipervnculo"/>
@@ -1520,6 +1540,98 @@
             <w:rStyle w:val="Hipervnculo"/>
             <w:noProof/>
           </w:rPr>
+          <w:t>Entrevistas Breves a los Representantes</w:t>
+        </w:r>
+        <w:r>
+          <w:rPr>
+            <w:noProof/>
+            <w:webHidden/>
+          </w:rPr>
+          <w:tab/>
+        </w:r>
+        <w:r>
+          <w:rPr>
+            <w:noProof/>
+            <w:webHidden/>
+          </w:rPr>
+          <w:fldChar w:fldCharType="begin"/>
+        </w:r>
+        <w:r>
+          <w:rPr>
+            <w:noProof/>
+            <w:webHidden/>
+          </w:rPr>
+          <w:instrText xml:space="preserve"> PAGEREF _Toc233459934 \h </w:instrText>
+        </w:r>
+        <w:r>
+          <w:rPr>
+            <w:noProof/>
+            <w:webHidden/>
+          </w:rPr>
+        </w:r>
+        <w:r>
+          <w:rPr>
+            <w:noProof/>
+            <w:webHidden/>
+          </w:rPr>
+          <w:fldChar w:fldCharType="separate"/>
+        </w:r>
+        <w:r>
+          <w:rPr>
+            <w:noProof/>
+            <w:webHidden/>
+          </w:rPr>
+          <w:t>5</w:t>
+        </w:r>
+        <w:r>
+          <w:rPr>
+            <w:noProof/>
+            <w:webHidden/>
+          </w:rPr>
+          <w:fldChar w:fldCharType="end"/>
+        </w:r>
+      </w:hyperlink>
+    </w:p>
+    <w:p>
+      <w:pPr>
+        <w:pStyle w:val="TDC3"/>
+        <w:tabs>
+          <w:tab w:val="left" w:pos="1200"/>
+          <w:tab w:val="right" w:leader="dot" w:pos="9016"/>
+        </w:tabs>
+        <w:rPr>
+          <w:rFonts w:asciiTheme="minorHAnsi" w:eastAsiaTheme="minorEastAsia" w:hAnsiTheme="minorHAnsi"/>
+          <w:noProof/>
+          <w:kern w:val="2"/>
+          <w:szCs w:val="24"/>
+          <w:lang w:eastAsia="es-PE"/>
+          <w14:ligatures w14:val="standardContextual"/>
+        </w:rPr>
+      </w:pPr>
+      <w:hyperlink w:anchor="_Toc233459935" w:history="1">
+        <w:r>
+          <w:rPr>
+            <w:rStyle w:val="Hipervnculo"/>
+            <w:noProof/>
+          </w:rPr>
+          <w:t>1.4.</w:t>
+        </w:r>
+        <w:r>
+          <w:rPr>
+            <w:rFonts w:asciiTheme="minorHAnsi" w:eastAsiaTheme="minorEastAsia" w:hAnsiTheme="minorHAnsi"/>
+            <w:noProof/>
+            <w:kern w:val="2"/>
+            <w:szCs w:val="24"/>
+            <w:lang w:eastAsia="es-PE"/>
+            <w14:ligatures w14:val="standardContextual"/>
+          </w:rPr>
+          <w:tab/>
+        </w:r>
+        <w:r>
+          <w:rPr>
+            <w:rStyle w:val="Hipervnculo"/>
+            <w:noProof/>
+          </w:rPr>
           <w:t>Perfiles de usuario</w:t>
         </w:r>
         <w:r>
@@ -1541,7 +1653,7 @@
             <w:noProof/>
             <w:webHidden/>
           </w:rPr>
-          <w:instrText xml:space="preserve"> PAGEREF _Toc232757468 \h </w:instrText>
+          <w:instrText xml:space="preserve"> PAGEREF _Toc233459935 \h </w:instrText>
         </w:r>
         <w:r>
           <w:rPr>
@@ -1561,7 +1673,7 @@
             <w:noProof/>
             <w:webHidden/>
           </w:rPr>
-          <w:t>7</w:t>
+          <w:t>8</w:t>
         </w:r>
         <w:r>
           <w:rPr>
@@ -1588,7 +1700,7 @@
           <w14:ligatures w14:val="standardContextual"/>
         </w:rPr>
       </w:pPr>
-      <w:hyperlink w:anchor="_Toc232757469" w:history="1">
+      <w:hyperlink w:anchor="_Toc233459936" w:history="1">
         <w:r>
           <w:rPr>
             <w:rStyle w:val="Hipervnculo"/>
@@ -1633,7 +1745,7 @@
             <w:noProof/>
             <w:webHidden/>
           </w:rPr>
-          <w:instrText xml:space="preserve"> PAGEREF _Toc232757469 \h </w:instrText>
+          <w:instrText xml:space="preserve"> PAGEREF _Toc233459936 \h </w:instrText>
         </w:r>
         <w:r>
           <w:rPr>
@@ -1653,7 +1765,7 @@
             <w:noProof/>
             <w:webHidden/>
           </w:rPr>
-          <w:t>9</w:t>
+          <w:t>10</w:t>
         </w:r>
         <w:r>
           <w:rPr>
@@ -1680,7 +1792,7 @@
           <w14:ligatures w14:val="standardContextual"/>
         </w:rPr>
       </w:pPr>
-      <w:hyperlink w:anchor="_Toc232757470" w:history="1">
+      <w:hyperlink w:anchor="_Toc233459937" w:history="1">
         <w:r>
           <w:rPr>
             <w:rStyle w:val="Hipervnculo"/>
@@ -1725,7 +1837,7 @@
             <w:noProof/>
             <w:webHidden/>
           </w:rPr>
-          <w:instrText xml:space="preserve"> PAGEREF _Toc232757470 \h </w:instrText>
+          <w:instrText xml:space="preserve"> PAGEREF _Toc233459937 \h </w:instrText>
         </w:r>
         <w:r>
           <w:rPr>
@@ -1745,7 +1857,7 @@
             <w:noProof/>
             <w:webHidden/>
           </w:rPr>
-          <w:t>9</w:t>
+          <w:t>10</w:t>
         </w:r>
         <w:r>
           <w:rPr>
@@ -1772,7 +1884,7 @@
           <w14:ligatures w14:val="standardContextual"/>
         </w:rPr>
       </w:pPr>
-      <w:hyperlink w:anchor="_Toc232757471" w:history="1">
+      <w:hyperlink w:anchor="_Toc233459938" w:history="1">
         <w:r>
           <w:rPr>
             <w:rStyle w:val="Hipervnculo"/>
@@ -1817,7 +1929,7 @@
             <w:noProof/>
             <w:webHidden/>
           </w:rPr>
-          <w:instrText xml:space="preserve"> PAGEREF _Toc232757471 \h </w:instrText>
+          <w:instrText xml:space="preserve"> PAGEREF _Toc233459938 \h </w:instrText>
         </w:r>
         <w:r>
           <w:rPr>
@@ -1837,7 +1949,7 @@
             <w:noProof/>
             <w:webHidden/>
           </w:rPr>
-          <w:t>10</w:t>
+          <w:t>11</w:t>
         </w:r>
         <w:r>
           <w:rPr>
@@ -1864,7 +1976,7 @@
           <w14:ligatures w14:val="standardContextual"/>
         </w:rPr>
       </w:pPr>
-      <w:hyperlink w:anchor="_Toc232757472" w:history="1">
+      <w:hyperlink w:anchor="_Toc233459939" w:history="1">
         <w:r>
           <w:rPr>
             <w:rStyle w:val="Hipervnculo"/>
@@ -1909,7 +2021,7 @@
             <w:noProof/>
             <w:webHidden/>
           </w:rPr>
-          <w:instrText xml:space="preserve"> PAGEREF _Toc232757472 \h </w:instrText>
+          <w:instrText xml:space="preserve"> PAGEREF _Toc233459939 \h </w:instrText>
         </w:r>
         <w:r>
           <w:rPr>
@@ -1929,7 +2041,7 @@
             <w:noProof/>
             <w:webHidden/>
           </w:rPr>
-          <w:t>10</w:t>
+          <w:t>11</w:t>
         </w:r>
         <w:r>
           <w:rPr>
@@ -1956,7 +2068,7 @@
           <w14:ligatures w14:val="standardContextual"/>
         </w:rPr>
       </w:pPr>
-      <w:hyperlink w:anchor="_Toc232757473" w:history="1">
+      <w:hyperlink w:anchor="_Toc233459940" w:history="1">
         <w:r>
           <w:rPr>
             <w:rStyle w:val="Hipervnculo"/>
@@ -2001,7 +2113,7 @@
             <w:noProof/>
             <w:webHidden/>
           </w:rPr>
-          <w:instrText xml:space="preserve"> PAGEREF _Toc232757473 \h </w:instrText>
+          <w:instrText xml:space="preserve"> PAGEREF _Toc233459940 \h </w:instrText>
         </w:r>
         <w:r>
           <w:rPr>
@@ -2021,7 +2133,7 @@
             <w:noProof/>
             <w:webHidden/>
           </w:rPr>
-          <w:t>12</w:t>
+          <w:t>13</w:t>
         </w:r>
         <w:r>
           <w:rPr>
@@ -2047,7 +2159,7 @@
           <w14:ligatures w14:val="standardContextual"/>
         </w:rPr>
       </w:pPr>
-      <w:hyperlink w:anchor="_Toc232757474" w:history="1">
+      <w:hyperlink w:anchor="_Toc233459941" w:history="1">
         <w:r>
           <w:rPr>
             <w:rStyle w:val="Hipervnculo"/>
@@ -2074,7 +2186,7 @@
             <w:noProof/>
             <w:webHidden/>
           </w:rPr>
-          <w:instrText xml:space="preserve"> PAGEREF _Toc232757474 \h </w:instrText>
+          <w:instrText xml:space="preserve"> PAGEREF _Toc233459941 \h </w:instrText>
         </w:r>
         <w:r>
           <w:rPr>
@@ -2094,7 +2206,7 @@
             <w:noProof/>
             <w:webHidden/>
           </w:rPr>
-          <w:t>13</w:t>
+          <w:t>14</w:t>
         </w:r>
         <w:r>
           <w:rPr>
@@ -2121,7 +2233,7 @@
           <w14:ligatures w14:val="standardContextual"/>
         </w:rPr>
       </w:pPr>
-      <w:hyperlink w:anchor="_Toc232757475" w:history="1">
+      <w:hyperlink w:anchor="_Toc233459942" w:history="1">
         <w:r>
           <w:rPr>
             <w:rStyle w:val="Hipervnculo"/>
@@ -2166,7 +2278,7 @@
             <w:noProof/>
             <w:webHidden/>
           </w:rPr>
-          <w:instrText xml:space="preserve"> PAGEREF _Toc232757475 \h </w:instrText>
+          <w:instrText xml:space="preserve"> PAGEREF _Toc233459942 \h </w:instrText>
         </w:r>
         <w:r>
           <w:rPr>
@@ -2186,7 +2298,7 @@
             <w:noProof/>
             <w:webHidden/>
           </w:rPr>
-          <w:t>13</w:t>
+          <w:t>14</w:t>
         </w:r>
         <w:r>
           <w:rPr>
@@ -2213,7 +2325,7 @@
           <w14:ligatures w14:val="standardContextual"/>
         </w:rPr>
       </w:pPr>
-      <w:hyperlink w:anchor="_Toc232757476" w:history="1">
+      <w:hyperlink w:anchor="_Toc233459943" w:history="1">
         <w:r>
           <w:rPr>
             <w:rStyle w:val="Hipervnculo"/>
@@ -2258,7 +2370,7 @@
             <w:noProof/>
             <w:webHidden/>
           </w:rPr>
-          <w:instrText xml:space="preserve"> PAGEREF _Toc232757476 \h </w:instrText>
+          <w:instrText xml:space="preserve"> PAGEREF _Toc233459943 \h </w:instrText>
         </w:r>
         <w:r>
           <w:rPr>
@@ -2278,7 +2390,7 @@
             <w:noProof/>
             <w:webHidden/>
           </w:rPr>
-          <w:t>13</w:t>
+          <w:t>14</w:t>
         </w:r>
         <w:r>
           <w:rPr>
@@ -2305,7 +2417,7 @@
           <w14:ligatures w14:val="standardContextual"/>
         </w:rPr>
       </w:pPr>
-      <w:hyperlink w:anchor="_Toc232757477" w:history="1">
+      <w:hyperlink w:anchor="_Toc233459944" w:history="1">
         <w:r>
           <w:rPr>
             <w:rStyle w:val="Hipervnculo"/>
@@ -2350,7 +2462,7 @@
             <w:noProof/>
             <w:webHidden/>
           </w:rPr>
-          <w:instrText xml:space="preserve"> PAGEREF _Toc232757477 \h </w:instrText>
+          <w:instrText xml:space="preserve"> PAGEREF _Toc233459944 \h </w:instrText>
         </w:r>
         <w:r>
           <w:rPr>
@@ -2370,7 +2482,7 @@
             <w:noProof/>
             <w:webHidden/>
           </w:rPr>
-          <w:t>13</w:t>
+          <w:t>15</w:t>
         </w:r>
         <w:r>
           <w:rPr>
@@ -2397,7 +2509,7 @@
           <w14:ligatures w14:val="standardContextual"/>
         </w:rPr>
       </w:pPr>
-      <w:hyperlink w:anchor="_Toc232757478" w:history="1">
+      <w:hyperlink w:anchor="_Toc233459945" w:history="1">
         <w:r>
           <w:rPr>
             <w:rStyle w:val="Hipervnculo"/>
@@ -2442,7 +2554,7 @@
             <w:noProof/>
             <w:webHidden/>
           </w:rPr>
-          <w:instrText xml:space="preserve"> PAGEREF _Toc232757478 \h </w:instrText>
+          <w:instrText xml:space="preserve"> PAGEREF _Toc233459945 \h </w:instrText>
         </w:r>
         <w:r>
           <w:rPr>
@@ -2462,7 +2574,7 @@
             <w:noProof/>
             <w:webHidden/>
           </w:rPr>
-          <w:t>14</w:t>
+          <w:t>16</w:t>
         </w:r>
         <w:r>
           <w:rPr>
@@ -2489,7 +2601,7 @@
           <w14:ligatures w14:val="standardContextual"/>
         </w:rPr>
       </w:pPr>
-      <w:hyperlink w:anchor="_Toc232757479" w:history="1">
+      <w:hyperlink w:anchor="_Toc233459946" w:history="1">
         <w:r>
           <w:rPr>
             <w:rStyle w:val="Hipervnculo"/>
@@ -2534,7 +2646,7 @@
             <w:noProof/>
             <w:webHidden/>
           </w:rPr>
-          <w:instrText xml:space="preserve"> PAGEREF _Toc232757479 \h </w:instrText>
+          <w:instrText xml:space="preserve"> PAGEREF _Toc233459946 \h </w:instrText>
         </w:r>
         <w:r>
           <w:rPr>
@@ -2554,7 +2666,99 @@
             <w:noProof/>
             <w:webHidden/>
           </w:rPr>
-          <w:t>14</w:t>
+          <w:t>16</w:t>
+        </w:r>
+        <w:r>
+          <w:rPr>
+            <w:noProof/>
+            <w:webHidden/>
+          </w:rPr>
+          <w:fldChar w:fldCharType="end"/>
+        </w:r>
+      </w:hyperlink>
+    </w:p>
+    <w:p>
+      <w:pPr>
+        <w:pStyle w:val="TDC3"/>
+        <w:tabs>
+          <w:tab w:val="left" w:pos="1200"/>
+          <w:tab w:val="right" w:leader="dot" w:pos="9016"/>
+        </w:tabs>
+        <w:rPr>
+          <w:rFonts w:asciiTheme="minorHAnsi" w:eastAsiaTheme="minorEastAsia" w:hAnsiTheme="minorHAnsi"/>
+          <w:noProof/>
+          <w:kern w:val="2"/>
+          <w:szCs w:val="24"/>
+          <w:lang w:eastAsia="es-PE"/>
+          <w14:ligatures w14:val="standardContextual"/>
+        </w:rPr>
+      </w:pPr>
+      <w:hyperlink w:anchor="_Toc233459947" w:history="1">
+        <w:r>
+          <w:rPr>
+            <w:rStyle w:val="Hipervnculo"/>
+            <w:noProof/>
+          </w:rPr>
+          <w:t>3.5.</w:t>
+        </w:r>
+        <w:r>
+          <w:rPr>
+            <w:rFonts w:asciiTheme="minorHAnsi" w:eastAsiaTheme="minorEastAsia" w:hAnsiTheme="minorHAnsi"/>
+            <w:noProof/>
+            <w:kern w:val="2"/>
+            <w:szCs w:val="24"/>
+            <w:lang w:eastAsia="es-PE"/>
+            <w14:ligatures w14:val="standardContextual"/>
+          </w:rPr>
+          <w:tab/>
+        </w:r>
+        <w:r>
+          <w:rPr>
+            <w:rStyle w:val="Hipervnculo"/>
+            <w:noProof/>
+          </w:rPr>
+          <w:t>Visualización de la aplicación web (Figma)</w:t>
+        </w:r>
+        <w:r>
+          <w:rPr>
+            <w:noProof/>
+            <w:webHidden/>
+          </w:rPr>
+          <w:tab/>
+        </w:r>
+        <w:r>
+          <w:rPr>
+            <w:noProof/>
+            <w:webHidden/>
+          </w:rPr>
+          <w:fldChar w:fldCharType="begin"/>
+        </w:r>
+        <w:r>
+          <w:rPr>
+            <w:noProof/>
+            <w:webHidden/>
+          </w:rPr>
+          <w:instrText xml:space="preserve"> PAGEREF _Toc233459947 \h </w:instrText>
+        </w:r>
+        <w:r>
+          <w:rPr>
+            <w:noProof/>
+            <w:webHidden/>
+          </w:rPr>
+        </w:r>
+        <w:r>
+          <w:rPr>
+            <w:noProof/>
+            <w:webHidden/>
+          </w:rPr>
+          <w:fldChar w:fldCharType="separate"/>
+        </w:r>
+        <w:r>
+          <w:rPr>
+            <w:noProof/>
+            <w:webHidden/>
+          </w:rPr>
+          <w:t>16</w:t>
         </w:r>
         <w:r>
           <w:rPr>
@@ -2581,7 +2785,7 @@
           <w14:ligatures w14:val="standardContextual"/>
         </w:rPr>
       </w:pPr>
-      <w:hyperlink w:anchor="_Toc232757480" w:history="1">
+      <w:hyperlink w:anchor="_Toc233459948" w:history="1">
         <w:r>
           <w:rPr>
             <w:rStyle w:val="Hipervnculo"/>
@@ -2626,7 +2830,7 @@
             <w:noProof/>
             <w:webHidden/>
           </w:rPr>
-          <w:instrText xml:space="preserve"> PAGEREF _Toc232757480 \h </w:instrText>
+          <w:instrText xml:space="preserve"> PAGEREF _Toc233459948 \h </w:instrText>
         </w:r>
         <w:r>
           <w:rPr>
@@ -2646,7 +2850,7 @@
             <w:noProof/>
             <w:webHidden/>
           </w:rPr>
-          <w:t>14</w:t>
+          <w:t>16</w:t>
         </w:r>
         <w:r>
           <w:rPr>
@@ -2673,7 +2877,7 @@
           <w14:ligatures w14:val="standardContextual"/>
         </w:rPr>
       </w:pPr>
-      <w:hyperlink w:anchor="_Toc232757481" w:history="1">
+      <w:hyperlink w:anchor="_Toc233459949" w:history="1">
         <w:r>
           <w:rPr>
             <w:rStyle w:val="Hipervnculo"/>
@@ -2720,7 +2924,7 @@
             <w:noProof/>
             <w:webHidden/>
           </w:rPr>
-          <w:instrText xml:space="preserve"> PAGEREF _Toc232757481 \h </w:instrText>
+          <w:instrText xml:space="preserve"> PAGEREF _Toc233459949 \h </w:instrText>
         </w:r>
         <w:r>
           <w:rPr>
@@ -2740,7 +2944,7 @@
             <w:noProof/>
             <w:webHidden/>
           </w:rPr>
-          <w:t>14</w:t>
+          <w:t>16</w:t>
         </w:r>
         <w:r>
           <w:rPr>
@@ -2767,7 +2971,7 @@
           <w14:ligatures w14:val="standardContextual"/>
         </w:rPr>
       </w:pPr>
-      <w:hyperlink w:anchor="_Toc232757482" w:history="1">
+      <w:hyperlink w:anchor="_Toc233459950" w:history="1">
         <w:r>
           <w:rPr>
             <w:rStyle w:val="Hipervnculo"/>
@@ -2814,7 +3018,7 @@
             <w:noProof/>
             <w:webHidden/>
           </w:rPr>
-          <w:instrText xml:space="preserve"> PAGEREF _Toc232757482 \h </w:instrText>
+          <w:instrText xml:space="preserve"> PAGEREF _Toc233459950 \h </w:instrText>
         </w:r>
         <w:r>
           <w:rPr>
@@ -2834,7 +3038,7 @@
             <w:noProof/>
             <w:webHidden/>
           </w:rPr>
-          <w:t>14</w:t>
+          <w:t>16</w:t>
         </w:r>
         <w:r>
           <w:rPr>
@@ -2861,7 +3065,7 @@
           <w14:ligatures w14:val="standardContextual"/>
         </w:rPr>
       </w:pPr>
-      <w:hyperlink w:anchor="_Toc232757483" w:history="1">
+      <w:hyperlink w:anchor="_Toc233459951" w:history="1">
         <w:r>
           <w:rPr>
             <w:rStyle w:val="Hipervnculo"/>
@@ -2908,7 +3112,7 @@
             <w:noProof/>
             <w:webHidden/>
           </w:rPr>
-          <w:instrText xml:space="preserve"> PAGEREF _Toc232757483 \h </w:instrText>
+          <w:instrText xml:space="preserve"> PAGEREF _Toc233459951 \h </w:instrText>
         </w:r>
         <w:r>
           <w:rPr>
@@ -2928,7 +3132,7 @@
             <w:noProof/>
             <w:webHidden/>
           </w:rPr>
-          <w:t>14</w:t>
+          <w:t>16</w:t>
         </w:r>
         <w:r>
           <w:rPr>
@@ -2955,7 +3159,7 @@
           <w14:ligatures w14:val="standardContextual"/>
         </w:rPr>
       </w:pPr>
-      <w:hyperlink w:anchor="_Toc232757484" w:history="1">
+      <w:hyperlink w:anchor="_Toc233459952" w:history="1">
         <w:r>
           <w:rPr>
             <w:rStyle w:val="Hipervnculo"/>
@@ -3000,7 +3204,7 @@
             <w:noProof/>
             <w:webHidden/>
           </w:rPr>
-          <w:instrText xml:space="preserve"> PAGEREF _Toc232757484 \h </w:instrText>
+          <w:instrText xml:space="preserve"> PAGEREF _Toc233459952 \h </w:instrText>
         </w:r>
         <w:r>
           <w:rPr>
@@ -3020,7 +3224,7 @@
             <w:noProof/>
             <w:webHidden/>
           </w:rPr>
-          <w:t>14</w:t>
+          <w:t>17</w:t>
         </w:r>
         <w:r>
           <w:rPr>
@@ -3047,7 +3251,7 @@
           <w14:ligatures w14:val="standardContextual"/>
         </w:rPr>
       </w:pPr>
-      <w:hyperlink w:anchor="_Toc232757485" w:history="1">
+      <w:hyperlink w:anchor="_Toc233459953" w:history="1">
         <w:r>
           <w:rPr>
             <w:rStyle w:val="Hipervnculo"/>
@@ -3092,7 +3296,7 @@
             <w:noProof/>
             <w:webHidden/>
           </w:rPr>
-          <w:instrText xml:space="preserve"> PAGEREF _Toc232757485 \h </w:instrText>
+          <w:instrText xml:space="preserve"> PAGEREF _Toc233459953 \h </w:instrText>
         </w:r>
         <w:r>
           <w:rPr>
@@ -3112,7 +3316,7 @@
             <w:noProof/>
             <w:webHidden/>
           </w:rPr>
-          <w:t>14</w:t>
+          <w:t>17</w:t>
         </w:r>
         <w:r>
           <w:rPr>
@@ -3139,7 +3343,7 @@
           <w14:ligatures w14:val="standardContextual"/>
         </w:rPr>
       </w:pPr>
-      <w:hyperlink w:anchor="_Toc232757486" w:history="1">
+      <w:hyperlink w:anchor="_Toc233459954" w:history="1">
         <w:r>
           <w:rPr>
             <w:rStyle w:val="Hipervnculo"/>
@@ -3184,7 +3388,7 @@
             <w:noProof/>
             <w:webHidden/>
           </w:rPr>
-          <w:instrText xml:space="preserve"> PAGEREF _Toc232757486 \h </w:instrText>
+          <w:instrText xml:space="preserve"> PAGEREF _Toc233459954 \h </w:instrText>
         </w:r>
         <w:r>
           <w:rPr>
@@ -3204,7 +3408,7 @@
             <w:noProof/>
             <w:webHidden/>
           </w:rPr>
-          <w:t>14</w:t>
+          <w:t>17</w:t>
         </w:r>
         <w:r>
           <w:rPr>
@@ -3231,7 +3435,7 @@
           <w14:ligatures w14:val="standardContextual"/>
         </w:rPr>
       </w:pPr>
-      <w:hyperlink w:anchor="_Toc232757487" w:history="1">
+      <w:hyperlink w:anchor="_Toc233459955" w:history="1">
         <w:r>
           <w:rPr>
             <w:rStyle w:val="Hipervnculo"/>
@@ -3276,7 +3480,7 @@
             <w:noProof/>
             <w:webHidden/>
           </w:rPr>
-          <w:instrText xml:space="preserve"> PAGEREF _Toc232757487 \h </w:instrText>
+          <w:instrText xml:space="preserve"> PAGEREF _Toc233459955 \h </w:instrText>
         </w:r>
         <w:r>
           <w:rPr>
@@ -3296,7 +3500,7 @@
             <w:noProof/>
             <w:webHidden/>
           </w:rPr>
-          <w:t>15</w:t>
+          <w:t>17</w:t>
         </w:r>
         <w:r>
           <w:rPr>
@@ -3323,7 +3527,7 @@
           <w14:ligatures w14:val="standardContextual"/>
         </w:rPr>
       </w:pPr>
-      <w:hyperlink w:anchor="_Toc232757488" w:history="1">
+      <w:hyperlink w:anchor="_Toc233459956" w:history="1">
         <w:r>
           <w:rPr>
             <w:rStyle w:val="Hipervnculo"/>
@@ -3368,7 +3572,7 @@
             <w:noProof/>
             <w:webHidden/>
           </w:rPr>
-          <w:instrText xml:space="preserve"> PAGEREF _Toc232757488 \h </w:instrText>
+          <w:instrText xml:space="preserve"> PAGEREF _Toc233459956 \h </w:instrText>
         </w:r>
         <w:r>
           <w:rPr>
@@ -3388,7 +3592,7 @@
             <w:noProof/>
             <w:webHidden/>
           </w:rPr>
-          <w:t>15</w:t>
+          <w:t>17</w:t>
         </w:r>
         <w:r>
           <w:rPr>
@@ -3414,7 +3618,7 @@
           <w14:ligatures w14:val="standardContextual"/>
         </w:rPr>
       </w:pPr>
-      <w:hyperlink w:anchor="_Toc232757489" w:history="1">
+      <w:hyperlink w:anchor="_Toc233459957" w:history="1">
         <w:r>
           <w:rPr>
             <w:rStyle w:val="Hipervnculo"/>
@@ -3441,7 +3645,7 @@
             <w:noProof/>
             <w:webHidden/>
           </w:rPr>
-          <w:instrText xml:space="preserve"> PAGEREF _Toc232757489 \h </w:instrText>
+          <w:instrText xml:space="preserve"> PAGEREF _Toc233459957 \h </w:instrText>
         </w:r>
         <w:r>
           <w:rPr>
@@ -3461,7 +3665,7 @@
             <w:noProof/>
             <w:webHidden/>
           </w:rPr>
-          <w:t>16</w:t>
+          <w:t>18</w:t>
         </w:r>
         <w:r>
           <w:rPr>
@@ -3488,7 +3692,7 @@
           <w14:ligatures w14:val="standardContextual"/>
         </w:rPr>
       </w:pPr>
-      <w:hyperlink w:anchor="_Toc232757490" w:history="1">
+      <w:hyperlink w:anchor="_Toc233459958" w:history="1">
         <w:r>
           <w:rPr>
             <w:rStyle w:val="Hipervnculo"/>
@@ -3533,7 +3737,7 @@
             <w:noProof/>
             <w:webHidden/>
           </w:rPr>
-          <w:instrText xml:space="preserve"> PAGEREF _Toc232757490 \h </w:instrText>
+          <w:instrText xml:space="preserve"> PAGEREF _Toc233459958 \h </w:instrText>
         </w:r>
         <w:r>
           <w:rPr>
@@ -3553,7 +3757,7 @@
             <w:noProof/>
             <w:webHidden/>
           </w:rPr>
-          <w:t>16</w:t>
+          <w:t>18</w:t>
         </w:r>
         <w:r>
           <w:rPr>
@@ -3580,7 +3784,7 @@
           <w14:ligatures w14:val="standardContextual"/>
         </w:rPr>
       </w:pPr>
-      <w:hyperlink w:anchor="_Toc232757491" w:history="1">
+      <w:hyperlink w:anchor="_Toc233459959" w:history="1">
         <w:r>
           <w:rPr>
             <w:rStyle w:val="Hipervnculo"/>
@@ -3625,7 +3829,7 @@
             <w:noProof/>
             <w:webHidden/>
           </w:rPr>
-          <w:instrText xml:space="preserve"> PAGEREF _Toc232757491 \h </w:instrText>
+          <w:instrText xml:space="preserve"> PAGEREF _Toc233459959 \h </w:instrText>
         </w:r>
         <w:r>
           <w:rPr>
@@ -3645,7 +3849,7 @@
             <w:noProof/>
             <w:webHidden/>
           </w:rPr>
-          <w:t>16</w:t>
+          <w:t>18</w:t>
         </w:r>
         <w:r>
           <w:rPr>
@@ -3672,7 +3876,7 @@
           <w14:ligatures w14:val="standardContextual"/>
         </w:rPr>
       </w:pPr>
-      <w:hyperlink w:anchor="_Toc232757492" w:history="1">
+      <w:hyperlink w:anchor="_Toc233459960" w:history="1">
         <w:r>
           <w:rPr>
             <w:rStyle w:val="Hipervnculo"/>
@@ -3717,7 +3921,7 @@
             <w:noProof/>
             <w:webHidden/>
           </w:rPr>
-          <w:instrText xml:space="preserve"> PAGEREF _Toc232757492 \h </w:instrText>
+          <w:instrText xml:space="preserve"> PAGEREF _Toc233459960 \h </w:instrText>
         </w:r>
         <w:r>
           <w:rPr>
@@ -3737,7 +3941,7 @@
             <w:noProof/>
             <w:webHidden/>
           </w:rPr>
-          <w:t>16</w:t>
+          <w:t>18</w:t>
         </w:r>
         <w:r>
           <w:rPr>
@@ -3764,7 +3968,7 @@
           <w14:ligatures w14:val="standardContextual"/>
         </w:rPr>
       </w:pPr>
-      <w:hyperlink w:anchor="_Toc232757493" w:history="1">
+      <w:hyperlink w:anchor="_Toc233459961" w:history="1">
         <w:r>
           <w:rPr>
             <w:rStyle w:val="Hipervnculo"/>
@@ -3809,7 +4013,7 @@
             <w:noProof/>
             <w:webHidden/>
           </w:rPr>
-          <w:instrText xml:space="preserve"> PAGEREF _Toc232757493 \h </w:instrText>
+          <w:instrText xml:space="preserve"> PAGEREF _Toc233459961 \h </w:instrText>
         </w:r>
         <w:r>
           <w:rPr>
@@ -3829,7 +4033,7 @@
             <w:noProof/>
             <w:webHidden/>
           </w:rPr>
-          <w:t>16</w:t>
+          <w:t>18</w:t>
         </w:r>
         <w:r>
           <w:rPr>
@@ -3856,7 +4060,7 @@
           <w14:ligatures w14:val="standardContextual"/>
         </w:rPr>
       </w:pPr>
-      <w:hyperlink w:anchor="_Toc232757494" w:history="1">
+      <w:hyperlink w:anchor="_Toc233459962" w:history="1">
         <w:r>
           <w:rPr>
             <w:rStyle w:val="Hipervnculo"/>
@@ -3901,7 +4105,7 @@
             <w:noProof/>
             <w:webHidden/>
           </w:rPr>
-          <w:instrText xml:space="preserve"> PAGEREF _Toc232757494 \h </w:instrText>
+          <w:instrText xml:space="preserve"> PAGEREF _Toc233459962 \h </w:instrText>
         </w:r>
         <w:r>
           <w:rPr>
@@ -3921,7 +4125,7 @@
             <w:noProof/>
             <w:webHidden/>
           </w:rPr>
-          <w:t>16</w:t>
+          <w:t>18</w:t>
         </w:r>
         <w:r>
           <w:rPr>
@@ -4041,7 +4245,7 @@
         </w:rPr>
         <w:fldChar w:fldCharType="separate"/>
       </w:r>
-      <w:hyperlink w:anchor="_Toc233391068" w:history="1">
+      <w:hyperlink w:anchor="_Toc233459923" w:history="1">
         <w:r>
           <w:rPr>
             <w:rStyle w:val="Hipervnculo"/>
@@ -4079,7 +4283,7 @@
             <w:noProof/>
             <w:webHidden/>
           </w:rPr>
-          <w:instrText xml:space="preserve"> PAGEREF _Toc233391068 \h </w:instrText>
+          <w:instrText xml:space="preserve"> PAGEREF _Toc233459923 \h </w:instrText>
         </w:r>
         <w:r>
           <w:rPr>
@@ -4125,7 +4329,7 @@
           <w14:ligatures w14:val="standardContextual"/>
         </w:rPr>
       </w:pPr>
-      <w:hyperlink w:anchor="_Toc233391069" w:history="1">
+      <w:hyperlink w:anchor="_Toc233459924" w:history="1">
         <w:r>
           <w:rPr>
             <w:rStyle w:val="Hipervnculo"/>
@@ -4163,7 +4367,7 @@
             <w:noProof/>
             <w:webHidden/>
           </w:rPr>
-          <w:instrText xml:space="preserve"> PAGEREF _Toc233391069 \h </w:instrText>
+          <w:instrText xml:space="preserve"> PAGEREF _Toc233459924 \h </w:instrText>
         </w:r>
         <w:r>
           <w:rPr>
@@ -4184,6 +4388,90 @@
             <w:webHidden/>
           </w:rPr>
           <w:t>14</w:t>
+        </w:r>
+        <w:r>
+          <w:rPr>
+            <w:noProof/>
+            <w:webHidden/>
+          </w:rPr>
+          <w:fldChar w:fldCharType="end"/>
+        </w:r>
+      </w:hyperlink>
+    </w:p>
+    <w:p>
+      <w:pPr>
+        <w:pStyle w:val="Tabladeilustraciones"/>
+        <w:tabs>
+          <w:tab w:val="right" w:leader="dot" w:pos="9016"/>
+        </w:tabs>
+        <w:rPr>
+          <w:rFonts w:asciiTheme="minorHAnsi" w:eastAsiaTheme="minorEastAsia" w:hAnsiTheme="minorHAnsi"/>
+          <w:noProof/>
+          <w:kern w:val="2"/>
+          <w:szCs w:val="24"/>
+          <w:lang w:eastAsia="es-PE"/>
+          <w14:ligatures w14:val="standardContextual"/>
+        </w:rPr>
+      </w:pPr>
+      <w:hyperlink w:anchor="_Toc233459925" w:history="1">
+        <w:r>
+          <w:rPr>
+            <w:rStyle w:val="Hipervnculo"/>
+            <w:rFonts w:cs="Times New Roman"/>
+            <w:b/>
+            <w:bCs/>
+            <w:noProof/>
+          </w:rPr>
+          <w:t>Figura 3</w:t>
+        </w:r>
+        <w:r>
+          <w:rPr>
+            <w:rStyle w:val="Hipervnculo"/>
+            <w:rFonts w:cs="Times New Roman"/>
+            <w:noProof/>
+          </w:rPr>
+          <w:t xml:space="preserve"> Flujo de Navegación Coherente</w:t>
+        </w:r>
+        <w:r>
+          <w:rPr>
+            <w:noProof/>
+            <w:webHidden/>
+          </w:rPr>
+          <w:tab/>
+        </w:r>
+        <w:r>
+          <w:rPr>
+            <w:noProof/>
+            <w:webHidden/>
+          </w:rPr>
+          <w:fldChar w:fldCharType="begin"/>
+        </w:r>
+        <w:r>
+          <w:rPr>
+            <w:noProof/>
+            <w:webHidden/>
+          </w:rPr>
+          <w:instrText xml:space="preserve"> PAGEREF _Toc233459925 \h </w:instrText>
+        </w:r>
+        <w:r>
+          <w:rPr>
+            <w:noProof/>
+            <w:webHidden/>
+          </w:rPr>
+        </w:r>
+        <w:r>
+          <w:rPr>
+            <w:noProof/>
+            <w:webHidden/>
+          </w:rPr>
+          <w:fldChar w:fldCharType="separate"/>
+        </w:r>
+        <w:r>
+          <w:rPr>
+            <w:noProof/>
+            <w:webHidden/>
+          </w:rPr>
+          <w:t>16</w:t>
         </w:r>
         <w:r>
           <w:rPr>
@@ -4238,7 +4526,6 @@
           <w:szCs w:val="24"/>
         </w:rPr>
       </w:pPr>
-      <w:bookmarkStart w:id="0" w:name="_Toc232757464"/>
       <w:r>
         <w:br w:type="page"/>
       </w:r>
@@ -4247,6 +4534,7 @@
       <w:pPr>
         <w:pStyle w:val="Ttulo1"/>
       </w:pPr>
+      <w:bookmarkStart w:id="0" w:name="_Toc233459930"/>
       <w:r>
         <w:lastRenderedPageBreak/>
         <w:t>CAPÍTULO I</w:t>
@@ -4257,7 +4545,7 @@
       <w:pPr>
         <w:pStyle w:val="Ttulo2"/>
       </w:pPr>
-      <w:bookmarkStart w:id="1" w:name="_Toc232757465"/>
+      <w:bookmarkStart w:id="1" w:name="_Toc233459931"/>
       <w:r>
         <w:t xml:space="preserve">Identificación </w:t>
       </w:r>
@@ -4271,7 +4559,15 @@
         <w:pStyle w:val="APATMA"/>
       </w:pPr>
       <w:r>
-        <w:t xml:space="preserve">El emprendimiento identificado fue MC BackPack, se dedica a la </w:t>
+        <w:t xml:space="preserve">El emprendimiento identificado fue MC </w:t>
+      </w:r>
+      <w:proofErr w:type="spellStart"/>
+      <w:r>
+        <w:t>BackPack</w:t>
+      </w:r>
+      <w:proofErr w:type="spellEnd"/>
+      <w:r>
+        <w:t xml:space="preserve">, se dedica a la </w:t>
       </w:r>
       <w:r>
         <w:t>confección e importación de mochilas opera bajo un modelo de negocio itinerante. Al no contar con un local comercial propio, su visibilidad y volumen de ventas dependen exclusivamente de los cronogramas y la afluencia de público en las ferias organizadas por las municipalidades.</w:t>
@@ -4284,14 +4580,14 @@
       <w:r>
         <w:t xml:space="preserve"> </w:t>
       </w:r>
-      <w:bookmarkStart w:id="2" w:name="_Toc232757466"/>
       <w:r>
         <w:t xml:space="preserve"> </w:t>
       </w:r>
+      <w:bookmarkStart w:id="2" w:name="_Toc233459932"/>
+      <w:r>
+        <w:t>Formulación del problema</w:t>
+      </w:r>
       <w:bookmarkEnd w:id="2"/>
-      <w:r>
-        <w:t>Formulación del problema</w:t>
-      </w:r>
     </w:p>
     <w:p>
       <w:pPr>
@@ -4308,8 +4604,17 @@
           <w:b/>
           <w:bCs/>
         </w:rPr>
-        <w:t>MC BackPack</w:t>
-      </w:r>
+        <w:t xml:space="preserve">MC </w:t>
+      </w:r>
+      <w:proofErr w:type="spellStart"/>
+      <w:r>
+        <w:rPr>
+          <w:b/>
+          <w:bCs/>
+        </w:rPr>
+        <w:t>BackPack</w:t>
+      </w:r>
+      <w:proofErr w:type="spellEnd"/>
       <w:r>
         <w:t>?</w:t>
       </w:r>
@@ -4319,11 +4624,16 @@
         <w:pStyle w:val="Ttulo3"/>
       </w:pPr>
       <w:r>
-        <w:t xml:space="preserve"> L</w:t>
+        <w:t xml:space="preserve"> </w:t>
+      </w:r>
+      <w:bookmarkStart w:id="3" w:name="_Toc233459933"/>
+      <w:r>
+        <w:t>L</w:t>
       </w:r>
       <w:r>
         <w:t>imitaciones identificadas</w:t>
       </w:r>
+      <w:bookmarkEnd w:id="3"/>
     </w:p>
     <w:p>
       <w:pPr>
@@ -4342,7 +4652,23 @@
           <w:b/>
           <w:bCs/>
         </w:rPr>
-        <w:t xml:space="preserve">Perdida de la relación post-venta: </w:t>
+        <w:t xml:space="preserve">Perdida de la relación </w:t>
+      </w:r>
+      <w:proofErr w:type="spellStart"/>
+      <w:r>
+        <w:rPr>
+          <w:b/>
+          <w:bCs/>
+        </w:rPr>
+        <w:t>post-venta</w:t>
+      </w:r>
+      <w:proofErr w:type="spellEnd"/>
+      <w:r>
+        <w:rPr>
+          <w:b/>
+          <w:bCs/>
+        </w:rPr>
+        <w:t xml:space="preserve">: </w:t>
       </w:r>
       <w:r>
         <w:t>Los clientes que compran en una feria no tienen un canal directo para volver a contactar al negocio, ver nuevos modelos o recomendar la marca.</w:t>
@@ -4404,11 +4730,11 @@
       <w:r>
         <w:t xml:space="preserve"> </w:t>
       </w:r>
-      <w:bookmarkStart w:id="3" w:name="_Toc232757467"/>
+      <w:bookmarkStart w:id="4" w:name="_Toc233459934"/>
       <w:r>
         <w:t>Entrevistas Breves a los Representantes</w:t>
       </w:r>
-      <w:bookmarkEnd w:id="3"/>
+      <w:bookmarkEnd w:id="4"/>
     </w:p>
     <w:p>
       <w:pPr>
@@ -4782,11 +5108,11 @@
       <w:pPr>
         <w:pStyle w:val="Ttulo3"/>
       </w:pPr>
-      <w:bookmarkStart w:id="4" w:name="_Toc232757468"/>
+      <w:bookmarkStart w:id="5" w:name="_Toc233459935"/>
       <w:r>
         <w:t>Perfiles de usuario</w:t>
       </w:r>
-      <w:bookmarkEnd w:id="4"/>
+      <w:bookmarkEnd w:id="5"/>
     </w:p>
     <w:p>
       <w:pPr>
@@ -5673,11 +5999,11 @@
       <w:pPr>
         <w:pStyle w:val="Ttulo2"/>
       </w:pPr>
-      <w:bookmarkStart w:id="5" w:name="_Toc232757469"/>
+      <w:bookmarkStart w:id="6" w:name="_Toc233459936"/>
       <w:r>
         <w:t>Justificación técnica y ética</w:t>
       </w:r>
-      <w:bookmarkEnd w:id="5"/>
+      <w:bookmarkEnd w:id="6"/>
     </w:p>
     <w:p>
       <w:pPr>
@@ -5686,11 +6012,11 @@
       <w:r>
         <w:t xml:space="preserve"> </w:t>
       </w:r>
-      <w:bookmarkStart w:id="6" w:name="_Toc232757470"/>
+      <w:bookmarkStart w:id="7" w:name="_Toc233459937"/>
       <w:r>
         <w:t>Problema delimitado</w:t>
       </w:r>
-      <w:bookmarkEnd w:id="6"/>
+      <w:bookmarkEnd w:id="7"/>
     </w:p>
     <w:p>
       <w:pPr>
@@ -5731,7 +6057,23 @@
           <w:b/>
           <w:bCs/>
         </w:rPr>
-        <w:t>Invisibilidad post-feria y pérdida de clientes:</w:t>
+        <w:t xml:space="preserve">Invisibilidad </w:t>
+      </w:r>
+      <w:proofErr w:type="spellStart"/>
+      <w:r>
+        <w:rPr>
+          <w:b/>
+          <w:bCs/>
+        </w:rPr>
+        <w:t>post-feria</w:t>
+      </w:r>
+      <w:proofErr w:type="spellEnd"/>
+      <w:r>
+        <w:rPr>
+          <w:b/>
+          <w:bCs/>
+        </w:rPr>
+        <w:t xml:space="preserve"> y pérdida de clientes:</w:t>
       </w:r>
       <w:r>
         <w:t xml:space="preserve"> Una vez que la feria concluye, el vínculo comercial con el cliente se rompe. Los usuarios interesados o recurrentes no disponen de una plataforma centralizada para ubicar el nuevo punto de atención del negocio.  </w:t>
@@ -5783,18 +6125,34 @@
       <w:r>
         <w:t xml:space="preserve"> </w:t>
       </w:r>
-      <w:bookmarkStart w:id="7" w:name="_Toc232757471"/>
+      <w:bookmarkStart w:id="8" w:name="_Toc233459938"/>
       <w:r>
         <w:t>Objetivo General</w:t>
       </w:r>
-      <w:bookmarkEnd w:id="7"/>
+      <w:bookmarkEnd w:id="8"/>
     </w:p>
     <w:p>
       <w:pPr>
         <w:pStyle w:val="APATMA"/>
       </w:pPr>
       <w:r>
-        <w:t>Desarrollar e implementar una aplicación web funcional de arquitectura cliente-servidor mediante un front-end responsivo (HTML5, CSS3, JavaScript y Bootstrap) y un back-end en Node.js con Express.js y persistencia en archivos JSON, con el fin de sistematizar los procesos de promoción, exhibición de catálogos y difusión cronológica de ferias itinerantes para un emprendimiento local de confección e importación de mochilas en Lima Metropolitana, garantizando la accesibilidad digital y un rendimiento óptimo en dispositivos móviles de gama media.</w:t>
+        <w:t xml:space="preserve">Desarrollar e implementar una aplicación web funcional de arquitectura cliente-servidor mediante un </w:t>
+      </w:r>
+      <w:proofErr w:type="spellStart"/>
+      <w:r>
+        <w:t>front-end</w:t>
+      </w:r>
+      <w:proofErr w:type="spellEnd"/>
+      <w:r>
+        <w:t xml:space="preserve"> responsivo (HTML5, CSS3, JavaScript y Bootstrap) y un back-</w:t>
+      </w:r>
+      <w:proofErr w:type="spellStart"/>
+      <w:r>
+        <w:t>end</w:t>
+      </w:r>
+      <w:proofErr w:type="spellEnd"/>
+      <w:r>
+        <w:t xml:space="preserve"> en Node.js con Express.js y persistencia en archivos JSON, con el fin de sistematizar los procesos de promoción, exhibición de catálogos y difusión cronológica de ferias itinerantes para un emprendimiento local de confección e importación de mochilas en Lima Metropolitana, garantizando la accesibilidad digital y un rendimiento óptimo en dispositivos móviles de gama media.</w:t>
       </w:r>
     </w:p>
     <w:p>
@@ -5804,14 +6162,14 @@
       <w:r>
         <w:t xml:space="preserve"> </w:t>
       </w:r>
-      <w:bookmarkStart w:id="8" w:name="_Toc232757472"/>
+      <w:bookmarkStart w:id="9" w:name="_Toc233459939"/>
       <w:r>
         <w:t>Objetivos</w:t>
       </w:r>
       <w:r>
         <w:t xml:space="preserve"> Específicos</w:t>
       </w:r>
-      <w:bookmarkEnd w:id="8"/>
+      <w:bookmarkEnd w:id="9"/>
     </w:p>
     <w:p>
       <w:pPr>
@@ -5844,10 +6202,34 @@
           <w:i/>
           <w:iCs/>
         </w:rPr>
-        <w:t>(Funcionalidad Front-end)</w:t>
-      </w:r>
-      <w:r>
-        <w:t xml:space="preserve">: Diseñar e implementar una interfaz web interactiva y responsiva (mobile-first) utilizando HTML5, CSS3 y Bootstrap 5, que reduzca la fricción de navegación y cargue eficientemente en dispositivos móviles de gama media.  </w:t>
+        <w:t>(Funcionalidad Front-</w:t>
+      </w:r>
+      <w:proofErr w:type="spellStart"/>
+      <w:r>
+        <w:rPr>
+          <w:i/>
+          <w:iCs/>
+        </w:rPr>
+        <w:t>end</w:t>
+      </w:r>
+      <w:proofErr w:type="spellEnd"/>
+      <w:r>
+        <w:rPr>
+          <w:i/>
+          <w:iCs/>
+        </w:rPr>
+        <w:t>)</w:t>
+      </w:r>
+      <w:r>
+        <w:t>: Diseñar e implementar una interfaz web interactiva y responsiva (</w:t>
+      </w:r>
+      <w:proofErr w:type="spellStart"/>
+      <w:r>
+        <w:t>mobile-first</w:t>
+      </w:r>
+      <w:proofErr w:type="spellEnd"/>
+      <w:r>
+        <w:t xml:space="preserve">) utilizando HTML5, CSS3 y Bootstrap 5, que reduzca la fricción de navegación y cargue eficientemente en dispositivos móviles de gama media.  </w:t>
       </w:r>
     </w:p>
     <w:p>
@@ -5876,7 +6258,15 @@
         <w:t>(Módulo de Geolocalización e Información)</w:t>
       </w:r>
       <w:r>
-        <w:t xml:space="preserve">: Desarrollar un apartado dinámico y cronológico para la gestión de ferias que centralice las ubicaciones, fechas y enlaces de Google Maps, logrando que el 100% de los </w:t>
+        <w:t xml:space="preserve">: Desarrollar un apartado dinámico y cronológico para la gestión de ferias que centralice las ubicaciones, fechas y enlaces de Google </w:t>
+      </w:r>
+      <w:proofErr w:type="spellStart"/>
+      <w:r>
+        <w:t>Maps</w:t>
+      </w:r>
+      <w:proofErr w:type="spellEnd"/>
+      <w:r>
+        <w:t xml:space="preserve">, logrando que el 100% de los </w:t>
       </w:r>
       <w:r>
         <w:lastRenderedPageBreak/>
@@ -5906,7 +6296,23 @@
           <w:i/>
           <w:iCs/>
         </w:rPr>
-        <w:t>(Persistencia y Lógica Back-end)</w:t>
+        <w:t>(Persistencia y Lógica Back-</w:t>
+      </w:r>
+      <w:proofErr w:type="spellStart"/>
+      <w:r>
+        <w:rPr>
+          <w:i/>
+          <w:iCs/>
+        </w:rPr>
+        <w:t>end</w:t>
+      </w:r>
+      <w:proofErr w:type="spellEnd"/>
+      <w:r>
+        <w:rPr>
+          <w:i/>
+          <w:iCs/>
+        </w:rPr>
+        <w:t>)</w:t>
       </w:r>
       <w:r>
         <w:t xml:space="preserve">: Configurar un servidor web funcional empleando Node.js y Express.js, estructurando rutas GET para servir el catálogo de mochilas y rutas POST para capturar y almacenar las solicitudes de compra en archivos JSON sin depender de sistemas de bases de datos complejos.  </w:t>
@@ -5956,12 +6362,12 @@
       <w:pPr>
         <w:pStyle w:val="Ttulo3"/>
       </w:pPr>
-      <w:bookmarkStart w:id="9" w:name="_Toc232757473"/>
+      <w:bookmarkStart w:id="10" w:name="_Toc233459940"/>
       <w:r>
         <w:lastRenderedPageBreak/>
         <w:t>Mapa de Empatía</w:t>
       </w:r>
-      <w:bookmarkEnd w:id="9"/>
+      <w:bookmarkEnd w:id="10"/>
     </w:p>
     <w:p>
       <w:pPr>
@@ -5984,7 +6390,7 @@
           <w:szCs w:val="24"/>
         </w:rPr>
       </w:pPr>
-      <w:bookmarkStart w:id="10" w:name="_Toc233391068"/>
+      <w:bookmarkStart w:id="11" w:name="_Toc233459923"/>
       <w:r>
         <w:rPr>
           <w:rFonts w:ascii="Times New Roman" w:hAnsi="Times New Roman" w:cs="Times New Roman"/>
@@ -6073,7 +6479,7 @@
         </w:rPr>
         <w:t xml:space="preserve"> Mapa de Empatía</w:t>
       </w:r>
-      <w:bookmarkEnd w:id="10"/>
+      <w:bookmarkEnd w:id="11"/>
     </w:p>
     <w:p>
       <w:pPr>
@@ -6189,37 +6595,54 @@
       <w:pPr>
         <w:pStyle w:val="Ttulo1"/>
       </w:pPr>
-      <w:bookmarkStart w:id="11" w:name="_Toc232757474"/>
+      <w:bookmarkStart w:id="12" w:name="_Toc233459941"/>
       <w:r>
         <w:lastRenderedPageBreak/>
         <w:t>CAPÍTULO II</w:t>
       </w:r>
-      <w:bookmarkEnd w:id="11"/>
+      <w:bookmarkEnd w:id="12"/>
     </w:p>
     <w:p>
       <w:pPr>
         <w:pStyle w:val="Ttulo2"/>
       </w:pPr>
-      <w:bookmarkStart w:id="12" w:name="_Toc232757475"/>
+      <w:bookmarkStart w:id="13" w:name="_Toc233459942"/>
       <w:r>
         <w:t>Arquitectura y tecnologías empleadas</w:t>
       </w:r>
-      <w:bookmarkEnd w:id="12"/>
+      <w:bookmarkEnd w:id="13"/>
     </w:p>
     <w:p>
       <w:pPr>
         <w:pStyle w:val="APATMA"/>
       </w:pPr>
       <w:r>
-        <w:t xml:space="preserve">Para solucionar los problemas de desconexión post-feria, la falta de visualización del stock real y la incertidumbre de localización que padece el emprendimiento </w:t>
-      </w:r>
-      <w:r>
-        <w:rPr>
-          <w:b/>
-          <w:bCs/>
-        </w:rPr>
-        <w:t>MC BackPack</w:t>
-      </w:r>
+        <w:t xml:space="preserve">Para solucionar los problemas de desconexión </w:t>
+      </w:r>
+      <w:proofErr w:type="spellStart"/>
+      <w:r>
+        <w:t>post-feria</w:t>
+      </w:r>
+      <w:proofErr w:type="spellEnd"/>
+      <w:r>
+        <w:t xml:space="preserve">, la falta de visualización del stock real y la incertidumbre de localización que padece el emprendimiento </w:t>
+      </w:r>
+      <w:r>
+        <w:rPr>
+          <w:b/>
+          <w:bCs/>
+        </w:rPr>
+        <w:t xml:space="preserve">MC </w:t>
+      </w:r>
+      <w:proofErr w:type="spellStart"/>
+      <w:r>
+        <w:rPr>
+          <w:b/>
+          <w:bCs/>
+        </w:rPr>
+        <w:t>BackPack</w:t>
+      </w:r>
+      <w:proofErr w:type="spellEnd"/>
       <w:r>
         <w:t xml:space="preserve">, se ha estructurado una solución basada en el patrón arquitectónico </w:t>
       </w:r>
@@ -6241,11 +6664,11 @@
       <w:r>
         <w:t xml:space="preserve"> </w:t>
       </w:r>
-      <w:bookmarkStart w:id="13" w:name="_Toc232757476"/>
+      <w:bookmarkStart w:id="14" w:name="_Toc233459943"/>
       <w:r>
         <w:t>Diagrama Detallado de la Arquitectura Cliente – Servidor</w:t>
       </w:r>
-      <w:bookmarkEnd w:id="13"/>
+      <w:bookmarkEnd w:id="14"/>
     </w:p>
     <w:p>
       <w:pPr>
@@ -6270,7 +6693,7 @@
           <w:szCs w:val="24"/>
         </w:rPr>
       </w:pPr>
-      <w:bookmarkStart w:id="14" w:name="_Toc233391069"/>
+      <w:bookmarkStart w:id="15" w:name="_Toc233459924"/>
       <w:r>
         <w:rPr>
           <w:rFonts w:ascii="Times New Roman" w:hAnsi="Times New Roman" w:cs="Times New Roman"/>
@@ -6359,7 +6782,7 @@
         </w:rPr>
         <w:t xml:space="preserve"> Diagrama de Arquitectura (Cliente - Servidor)</w:t>
       </w:r>
-      <w:bookmarkEnd w:id="14"/>
+      <w:bookmarkEnd w:id="15"/>
     </w:p>
     <w:p>
       <w:pPr>
@@ -6374,7 +6797,7 @@
           <w:noProof/>
         </w:rPr>
         <w:drawing>
-          <wp:inline distT="0" distB="0" distL="0" distR="0" wp14:anchorId="62718F2A" wp14:editId="130E14C2">
+          <wp:inline distT="0" distB="0" distL="0" distR="0" wp14:anchorId="62718F2A" wp14:editId="405DED30">
             <wp:extent cx="5177481" cy="2650691"/>
             <wp:effectExtent l="0" t="0" r="4445" b="0"/>
             <wp:docPr id="574375941" name="Picture 1"/>
@@ -6454,11 +6877,11 @@
         <w:lastRenderedPageBreak/>
         <w:t xml:space="preserve"> </w:t>
       </w:r>
-      <w:bookmarkStart w:id="15" w:name="_Toc232757477"/>
+      <w:bookmarkStart w:id="16" w:name="_Toc233459944"/>
       <w:r>
         <w:t>Justificación del Stack Tecnológico (Mobile – First y Rendimiento)</w:t>
       </w:r>
-      <w:bookmarkEnd w:id="15"/>
+      <w:bookmarkEnd w:id="16"/>
     </w:p>
     <w:p>
       <w:pPr>
@@ -6777,13 +7200,31 @@
             <w:r>
               <w:t xml:space="preserve">Framework optimizando para diseños </w:t>
             </w:r>
+            <w:proofErr w:type="spellStart"/>
             <w:r>
               <w:rPr>
                 <w:i/>
                 <w:iCs/>
               </w:rPr>
-              <w:t>mobile – first</w:t>
+              <w:t>mobile</w:t>
             </w:r>
+            <w:proofErr w:type="spellEnd"/>
+            <w:r>
+              <w:rPr>
+                <w:i/>
+                <w:iCs/>
+              </w:rPr>
+              <w:t xml:space="preserve"> – </w:t>
+            </w:r>
+            <w:proofErr w:type="spellStart"/>
+            <w:r>
+              <w:rPr>
+                <w:i/>
+                <w:iCs/>
+              </w:rPr>
+              <w:t>first</w:t>
+            </w:r>
+            <w:proofErr w:type="spellEnd"/>
             <w:r>
               <w:t>. Permite crear grillas elásticas que adaptan las fotos de las mochilas al instante en el móvil de Eduardo o de Madai sin romper el diseño.</w:t>
             </w:r>
@@ -6935,7 +7376,15 @@
               <w:ind w:firstLine="0"/>
             </w:pPr>
             <w:r>
-              <w:t>Base de datos ligera basada en archivos de texto planos. Evite sobrecargar el servidor backend, facilitando la lectura directa del stock y la edición ágil para el microempresario.</w:t>
+              <w:t xml:space="preserve">Base de datos ligera basada en archivos de texto planos. Evite sobrecargar el servidor </w:t>
+            </w:r>
+            <w:proofErr w:type="spellStart"/>
+            <w:r>
+              <w:t>backend</w:t>
+            </w:r>
+            <w:proofErr w:type="spellEnd"/>
+            <w:r>
+              <w:t>, facilitando la lectura directa del stock y la edición ágil para el microempresario.</w:t>
             </w:r>
           </w:p>
         </w:tc>
@@ -6959,7 +7408,15 @@
         <w:t xml:space="preserve">Nota. </w:t>
       </w:r>
       <w:r>
-        <w:t>Elaboración propia. María, Eduardo y Madai corresponden a los buyer personas o perfiles de usuario identificados en los requerimientos del sistema.</w:t>
+        <w:t xml:space="preserve">Elaboración propia. María, Eduardo y Madai corresponden a los </w:t>
+      </w:r>
+      <w:proofErr w:type="spellStart"/>
+      <w:r>
+        <w:t>buyer</w:t>
+      </w:r>
+      <w:proofErr w:type="spellEnd"/>
+      <w:r>
+        <w:t xml:space="preserve"> personas o perfiles de usuario identificados en los requerimientos del sistema.</w:t>
       </w:r>
     </w:p>
     <w:p>
@@ -6969,11 +7426,19 @@
       <w:r>
         <w:t xml:space="preserve"> </w:t>
       </w:r>
-      <w:bookmarkStart w:id="16" w:name="_Toc232757478"/>
-      <w:r>
-        <w:t>Flujo de Navegación Coherente (User Flow)</w:t>
-      </w:r>
-      <w:bookmarkEnd w:id="16"/>
+      <w:bookmarkStart w:id="17" w:name="_Toc233459945"/>
+      <w:r>
+        <w:t>Flujo de Navegación Coherente (</w:t>
+      </w:r>
+      <w:proofErr w:type="spellStart"/>
+      <w:r>
+        <w:t>User</w:t>
+      </w:r>
+      <w:proofErr w:type="spellEnd"/>
+      <w:r>
+        <w:t xml:space="preserve"> Flow)</w:t>
+      </w:r>
+      <w:bookmarkEnd w:id="17"/>
     </w:p>
     <w:p>
       <w:pPr>
@@ -7009,6 +7474,7 @@
           <w:szCs w:val="24"/>
         </w:rPr>
       </w:pPr>
+      <w:bookmarkStart w:id="18" w:name="_Toc233459925"/>
       <w:r>
         <w:rPr>
           <w:rFonts w:ascii="Times New Roman" w:hAnsi="Times New Roman" w:cs="Times New Roman"/>
@@ -7097,6 +7563,7 @@
         </w:rPr>
         <w:t xml:space="preserve"> Flujo de Navegación Coherente</w:t>
       </w:r>
+      <w:bookmarkEnd w:id="18"/>
     </w:p>
     <w:p>
       <w:pPr>
@@ -7167,15 +7634,36 @@
       <w:r>
         <w:t xml:space="preserve"> </w:t>
       </w:r>
-      <w:bookmarkStart w:id="17" w:name="_Toc232757479"/>
-      <w:r>
-        <w:t>Especificaciones de Diseño y Accesibilidad en Wireframes</w:t>
-      </w:r>
-      <w:bookmarkEnd w:id="17"/>
-    </w:p>
-    <w:p>
-      <w:r>
-        <w:t>“Insertar todos lo wirframes con un breve párrafo explicandolo”</w:t>
+      <w:bookmarkStart w:id="19" w:name="_Toc233459946"/>
+      <w:r>
+        <w:t xml:space="preserve">Especificaciones de Diseño y Accesibilidad en </w:t>
+      </w:r>
+      <w:proofErr w:type="spellStart"/>
+      <w:r>
+        <w:t>Wireframes</w:t>
+      </w:r>
+      <w:bookmarkEnd w:id="19"/>
+      <w:proofErr w:type="spellEnd"/>
+    </w:p>
+    <w:p>
+      <w:r>
+        <w:t xml:space="preserve">“Insertar todos lo </w:t>
+      </w:r>
+      <w:proofErr w:type="spellStart"/>
+      <w:r>
+        <w:t>wirframes</w:t>
+      </w:r>
+      <w:proofErr w:type="spellEnd"/>
+      <w:r>
+        <w:t xml:space="preserve"> con un breve párrafo </w:t>
+      </w:r>
+      <w:proofErr w:type="spellStart"/>
+      <w:r>
+        <w:t>explicandolo</w:t>
+      </w:r>
+      <w:proofErr w:type="spellEnd"/>
+      <w:r>
+        <w:t>”</w:t>
       </w:r>
     </w:p>
     <w:p>
@@ -7183,8 +7671,13 @@
         <w:pStyle w:val="Ttulo3"/>
       </w:pPr>
       <w:r>
-        <w:t xml:space="preserve"> Visualización de la aplicación web (Figma)</w:t>
-      </w:r>
+        <w:t xml:space="preserve"> </w:t>
+      </w:r>
+      <w:bookmarkStart w:id="20" w:name="_Toc233459947"/>
+      <w:r>
+        <w:t>Visualización de la aplicación web (Figma)</w:t>
+      </w:r>
+      <w:bookmarkEnd w:id="20"/>
     </w:p>
     <w:p>
       <w:pPr>
@@ -7192,8 +7685,13 @@
         <w:ind w:firstLine="0"/>
       </w:pPr>
       <w:r>
-        <w:t>Pegar solamente las imágenes del figma</w:t>
-      </w:r>
+        <w:t xml:space="preserve">Pegar solamente las imágenes del </w:t>
+      </w:r>
+      <w:proofErr w:type="spellStart"/>
+      <w:r>
+        <w:t>figma</w:t>
+      </w:r>
+      <w:proofErr w:type="spellEnd"/>
     </w:p>
     <w:p>
       <w:pPr>
@@ -7209,11 +7707,11 @@
       <w:pPr>
         <w:pStyle w:val="Ttulo2"/>
       </w:pPr>
-      <w:bookmarkStart w:id="18" w:name="_Toc232757480"/>
+      <w:bookmarkStart w:id="21" w:name="_Toc233459948"/>
       <w:r>
         <w:t>Descripción de funcionalidades</w:t>
       </w:r>
-      <w:bookmarkEnd w:id="18"/>
+      <w:bookmarkEnd w:id="21"/>
     </w:p>
     <w:p>
       <w:pPr>
@@ -7228,14 +7726,14 @@
         </w:rPr>
         <w:t xml:space="preserve"> </w:t>
       </w:r>
-      <w:bookmarkStart w:id="19" w:name="_Toc232757481"/>
+      <w:bookmarkStart w:id="22" w:name="_Toc233459949"/>
       <w:r>
         <w:rPr>
           <w:lang w:val="en-US"/>
         </w:rPr>
         <w:t>Front – End (HTML, CSS, JS)</w:t>
       </w:r>
-      <w:bookmarkEnd w:id="19"/>
+      <w:bookmarkEnd w:id="22"/>
       <w:r>
         <w:rPr>
           <w:lang w:val="en-US"/>
@@ -7256,14 +7754,14 @@
         </w:rPr>
         <w:t xml:space="preserve"> </w:t>
       </w:r>
-      <w:bookmarkStart w:id="20" w:name="_Toc232757482"/>
+      <w:bookmarkStart w:id="23" w:name="_Toc233459950"/>
       <w:r>
         <w:rPr>
           <w:lang w:val="en-US"/>
         </w:rPr>
         <w:t>Back – End (Node.js, Express)</w:t>
       </w:r>
-      <w:bookmarkEnd w:id="20"/>
+      <w:bookmarkEnd w:id="23"/>
       <w:r>
         <w:rPr>
           <w:lang w:val="en-US"/>
@@ -7284,25 +7782,41 @@
         </w:rPr>
         <w:t xml:space="preserve"> </w:t>
       </w:r>
-      <w:bookmarkStart w:id="21" w:name="_Toc232757483"/>
+      <w:bookmarkStart w:id="24" w:name="_Toc233459951"/>
+      <w:proofErr w:type="spellStart"/>
       <w:r>
         <w:rPr>
           <w:lang w:val="en-US"/>
         </w:rPr>
-        <w:t>Características implementadas</w:t>
-      </w:r>
-      <w:bookmarkEnd w:id="21"/>
+        <w:t>Características</w:t>
+      </w:r>
+      <w:proofErr w:type="spellEnd"/>
+      <w:r>
+        <w:rPr>
+          <w:lang w:val="en-US"/>
+        </w:rPr>
+        <w:t xml:space="preserve"> </w:t>
+      </w:r>
+      <w:proofErr w:type="spellStart"/>
+      <w:r>
+        <w:rPr>
+          <w:lang w:val="en-US"/>
+        </w:rPr>
+        <w:t>implementadas</w:t>
+      </w:r>
+      <w:bookmarkEnd w:id="24"/>
+      <w:proofErr w:type="spellEnd"/>
     </w:p>
     <w:p>
       <w:pPr>
         <w:pStyle w:val="Ttulo2"/>
       </w:pPr>
-      <w:bookmarkStart w:id="22" w:name="_Toc232757484"/>
+      <w:bookmarkStart w:id="25" w:name="_Toc233459952"/>
       <w:r>
         <w:lastRenderedPageBreak/>
         <w:t>Buenas prácticas aplicadas</w:t>
       </w:r>
-      <w:bookmarkEnd w:id="22"/>
+      <w:bookmarkEnd w:id="25"/>
     </w:p>
     <w:p>
       <w:pPr>
@@ -7311,11 +7825,11 @@
       <w:r>
         <w:t xml:space="preserve"> </w:t>
       </w:r>
-      <w:bookmarkStart w:id="23" w:name="_Toc232757485"/>
+      <w:bookmarkStart w:id="26" w:name="_Toc233459953"/>
       <w:r>
         <w:t>Accesibilidad</w:t>
       </w:r>
-      <w:bookmarkEnd w:id="23"/>
+      <w:bookmarkEnd w:id="26"/>
       <w:r>
         <w:t xml:space="preserve"> </w:t>
       </w:r>
@@ -7327,11 +7841,11 @@
       <w:r>
         <w:t xml:space="preserve"> </w:t>
       </w:r>
-      <w:bookmarkStart w:id="24" w:name="_Toc232757486"/>
+      <w:bookmarkStart w:id="27" w:name="_Toc233459954"/>
       <w:r>
         <w:t>Privacidad</w:t>
       </w:r>
-      <w:bookmarkEnd w:id="24"/>
+      <w:bookmarkEnd w:id="27"/>
       <w:r>
         <w:t xml:space="preserve"> </w:t>
       </w:r>
@@ -7343,11 +7857,11 @@
       <w:r>
         <w:t xml:space="preserve"> </w:t>
       </w:r>
-      <w:bookmarkStart w:id="25" w:name="_Toc232757487"/>
+      <w:bookmarkStart w:id="28" w:name="_Toc233459955"/>
       <w:r>
         <w:t>Diseño Responsivo</w:t>
       </w:r>
-      <w:bookmarkEnd w:id="25"/>
+      <w:bookmarkEnd w:id="28"/>
       <w:r>
         <w:t xml:space="preserve"> </w:t>
       </w:r>
@@ -7359,7 +7873,7 @@
       <w:r>
         <w:t xml:space="preserve"> </w:t>
       </w:r>
-      <w:bookmarkStart w:id="26" w:name="_Toc232757488"/>
+      <w:bookmarkStart w:id="29" w:name="_Toc233459956"/>
       <w:r>
         <w:t>Resultados de Valida</w:t>
       </w:r>
@@ -7372,7 +7886,7 @@
       <w:r>
         <w:t>suarios</w:t>
       </w:r>
-      <w:bookmarkEnd w:id="26"/>
+      <w:bookmarkEnd w:id="29"/>
       <w:r>
         <w:t xml:space="preserve"> </w:t>
       </w:r>
@@ -7417,22 +7931,22 @@
       <w:pPr>
         <w:pStyle w:val="Ttulo1"/>
       </w:pPr>
-      <w:bookmarkStart w:id="27" w:name="_Toc232757489"/>
+      <w:bookmarkStart w:id="30" w:name="_Toc233459957"/>
       <w:r>
         <w:lastRenderedPageBreak/>
         <w:t>CAPÍTULO III</w:t>
       </w:r>
-      <w:bookmarkEnd w:id="27"/>
+      <w:bookmarkEnd w:id="30"/>
     </w:p>
     <w:p>
       <w:pPr>
         <w:pStyle w:val="Ttulo2"/>
       </w:pPr>
-      <w:bookmarkStart w:id="28" w:name="_Toc232757490"/>
+      <w:bookmarkStart w:id="31" w:name="_Toc233459958"/>
       <w:r>
         <w:t>Conclusiones y aprendizajes</w:t>
       </w:r>
-      <w:bookmarkEnd w:id="28"/>
+      <w:bookmarkEnd w:id="31"/>
     </w:p>
     <w:p>
       <w:pPr>
@@ -7441,11 +7955,11 @@
       <w:r>
         <w:t xml:space="preserve"> </w:t>
       </w:r>
-      <w:bookmarkStart w:id="29" w:name="_Toc232757491"/>
+      <w:bookmarkStart w:id="32" w:name="_Toc233459959"/>
       <w:r>
         <w:t>Reflexión técnica</w:t>
       </w:r>
-      <w:bookmarkEnd w:id="29"/>
+      <w:bookmarkEnd w:id="32"/>
       <w:r>
         <w:t xml:space="preserve"> </w:t>
       </w:r>
@@ -7457,11 +7971,11 @@
       <w:r>
         <w:t xml:space="preserve"> </w:t>
       </w:r>
-      <w:bookmarkStart w:id="30" w:name="_Toc232757492"/>
+      <w:bookmarkStart w:id="33" w:name="_Toc233459960"/>
       <w:r>
         <w:t>Impacto Social</w:t>
       </w:r>
-      <w:bookmarkEnd w:id="30"/>
+      <w:bookmarkEnd w:id="33"/>
       <w:r>
         <w:t xml:space="preserve"> </w:t>
       </w:r>
@@ -7473,11 +7987,11 @@
       <w:r>
         <w:t xml:space="preserve"> </w:t>
       </w:r>
-      <w:bookmarkStart w:id="31" w:name="_Toc232757493"/>
+      <w:bookmarkStart w:id="34" w:name="_Toc233459961"/>
       <w:r>
         <w:t>Lecciones aprendidas</w:t>
       </w:r>
-      <w:bookmarkEnd w:id="31"/>
+      <w:bookmarkEnd w:id="34"/>
       <w:r>
         <w:t xml:space="preserve"> </w:t>
       </w:r>
@@ -7489,11 +8003,11 @@
       <w:r>
         <w:t xml:space="preserve"> </w:t>
       </w:r>
-      <w:bookmarkStart w:id="32" w:name="_Toc232757494"/>
+      <w:bookmarkStart w:id="35" w:name="_Toc233459962"/>
       <w:r>
         <w:t>Mejoras futuras</w:t>
       </w:r>
-      <w:bookmarkEnd w:id="32"/>
+      <w:bookmarkEnd w:id="35"/>
     </w:p>
     <w:p>
       <w:pPr>

</xml_diff>